<commit_message>
docs(semana-7): evidencia GitHub en rama feature/semana-7-documentacion-cierre
Captura la rama de trabajo actual con el commit de cierre MVP y actualiza
documentación y DOCX oficial con la nueva evidencia.
</commit_message>
<xml_diff>
--- a/docs/semana-7/TSY2201_EXP2_S7_Formato_respuesta_Aulafy_Semana7.docx
+++ b/docs/semana-7/TSY2201_EXP2_S7_Formato_respuesta_Aulafy_Semana7.docx
@@ -1450,7 +1450,7 @@
           </w:p>
           <w:p>
             <w:r>
-              <w:t>1_GitHub_rama_develop_semana7.png; 6_Cobertura_tests_backend.png; 7_Matriz_pruebas_negras.png; 8_Build_frontend_OK.png;</w:t>
+              <w:t>1_GitHub_rama_semana7_documentacion_cierre.png; 6_Cobertura_tests_backend.png; 7_Matriz_pruebas_negras.png; 8_Build_frontend_OK.png;</w:t>
             </w:r>
           </w:p>
           <w:p>
@@ -1673,7 +1673,7 @@
     </w:p>
     <w:p>
       <w:r>
-        <w:t>Repositorio GitHub — rama develop</w:t>
+        <w:t>GitHub — rama feature/semana-7-documentacion-cierre</w:t>
       </w:r>
     </w:p>
     <w:p>
@@ -1689,7 +1689,7 @@
               <a:graphicData uri="http://schemas.openxmlformats.org/drawingml/2006/picture">
                 <pic:pic>
                   <pic:nvPicPr>
-                    <pic:cNvPr id="0" name="1_GitHub_rama_develop_semana7.png"/>
+                    <pic:cNvPr id="0" name="1_GitHub_rama_semana7_documentacion_cierre.png"/>
                     <pic:cNvPicPr/>
                   </pic:nvPicPr>
                   <pic:blipFill>

</xml_diff>

<commit_message>
docs(semana-7): cierre integrado en semana-7-new
Actualiza metricas (56 tests), permisos role_in_course, riesgo docente,
tarjeta Mensajes del curso en dashboard apoderado, evidencias Vercel y DOCX.
</commit_message>
<xml_diff>
--- a/docs/semana-7/TSY2201_EXP2_S7_Formato_respuesta_Aulafy_Semana7.docx
+++ b/docs/semana-7/TSY2201_EXP2_S7_Formato_respuesta_Aulafy_Semana7.docx
@@ -524,7 +524,7 @@
             <w:r>
               <w:t>Fecha:</w:t>
               <w:br/>
-              <w:t>4 de julio de 2026</w:t>
+              <w:t>5 de julio de 2026</w:t>
             </w:r>
           </w:p>
         </w:tc>
@@ -1044,17 +1044,12 @@
           </w:p>
           <w:p>
             <w:r>
-              <w:t>Rama de entrega: develop (trabajo Semana 7 en feature/semana-7-documentacion-cierre).</w:t>
+              <w:t>Rama de entrega: develop (integración final en rama semana-7-new).</w:t>
             </w:r>
           </w:p>
           <w:p>
             <w:r>
-              <w:t>El repositorio contiene frontend Angular 21, backend NestJS, scripts MySQL, documentación por semana, workflows CI/CD y scripts AWS.</w:t>
-            </w:r>
-          </w:p>
-          <w:p>
-            <w:r>
-              <w:t>Documentación Semana 7: docs/semana-7/ (plan de trabajo, resultados de pruebas y evidencias).</w:t>
+              <w:t>Documentación Semana 7: docs/semana-7/ (plan, resultados, evidencias y DOCX oficial).</w:t>
             </w:r>
           </w:p>
         </w:tc>
@@ -1159,12 +1154,7 @@
           </w:tcPr>
           <w:p>
             <w:r>
-              <w:t>Frontend (Vercel — versión actual con fix UI): https://aulafy-web.vercel.app</w:t>
-            </w:r>
-          </w:p>
-          <w:p>
-            <w:r>
-              <w:t>Frontend AWS S3 (build anterior): http://aulafy-frontend-803615173905.s3-website.us-east-2.amazonaws.com</w:t>
+              <w:t>Frontend (Vercel — versión actual): https://aulafy-web.vercel.app</w:t>
             </w:r>
           </w:p>
           <w:p>
@@ -1179,7 +1169,7 @@
           </w:p>
           <w:p>
             <w:r>
-              <w:t>El entorno Vercel consume el mismo backend AWS mediante proxy /api. Base de datos: Amazon RDS MySQL 8.x (staging académico).</w:t>
+              <w:t>Vercel consume el backend AWS mediante proxy /api. Base de datos: Amazon RDS MySQL 8.x.</w:t>
             </w:r>
           </w:p>
         </w:tc>
@@ -1296,12 +1286,7 @@
           </w:p>
           <w:p>
             <w:r>
-              <w:t>Aulafy alcanza en Semana 7 el cierre del MVP. Se completaron las funcionalidades planificadas, se ejecutaron pruebas finales (caja blanca, negra y gris) y el sistema permanece accesible en nube para revisión del docente.</w:t>
-            </w:r>
-          </w:p>
-          <w:p>
-            <w:r>
-              <w:t>Arquitectura cliente-servidor con backend monolito modular NestJS (no microservicios). Integración continua con GitHub Actions.</w:t>
+              <w:t>Aulafy cierra el MVP en Semana 7 con pruebas finales (caja blanca, negra y gris), documentación completa y despliegue accesible en nube.</w:t>
             </w:r>
           </w:p>
           <w:p>
@@ -1309,17 +1294,22 @@
           </w:p>
           <w:p>
             <w:r>
-              <w:t>2. FUNCIONALIDADES IMPLEMENTADAS Y DISPONIBLES</w:t>
+              <w:t>2. FUNCIONALIDADES IMPLEMENTADAS</w:t>
             </w:r>
           </w:p>
           <w:p>
             <w:r>
-              <w:t>Autenticación JWT; dashboards por rol; muro académico; calendario; notas y evaluaciones; asistencia; anotaciones; chat interno por curso (REST); riesgo académico (promedio &lt; 4.0 o asistencia &lt; 85%); notificaciones Telegram opcionales; health check.</w:t>
+              <w:t>Autenticación JWT; dashboards por rol; muro; calendario; notas; asistencia; anotaciones; chat REST; riesgo académico; notificaciones Telegram opcionales.</w:t>
             </w:r>
           </w:p>
           <w:p>
             <w:r>
-              <w:t>Chat incluido en MVP para PROFESOR, APODERADO y ESTUDIANTE. Riesgo académico para ADMIN y COLEGIO.</w:t>
+              <w:t>Chat en MVP para PROFESOR, APODERADO y ESTUDIANTE. Riesgo académico para ADMIN, COLEGIO y PROFESOR (alertas de sus cursos).</w:t>
+            </w:r>
+          </w:p>
+          <w:p>
+            <w:r>
+              <w:t>Dashboard apoderado/estudiante incluye acceso directo a Mensajes del curso.</w:t>
             </w:r>
           </w:p>
           <w:p>
@@ -1327,27 +1317,22 @@
           </w:p>
           <w:p>
             <w:r>
-              <w:t>3. DEFINICIONES DE ALCANCE ACORDADAS CON EL DOCENTE</w:t>
+              <w:t>3. ALCANCE ACORDADO CON EL DOCENTE</w:t>
             </w:r>
           </w:p>
           <w:p>
             <w:r>
-              <w:t>Chat: DENTRO del MVP (Opción B). Limitación: sin WebSocket; recarga manual.</w:t>
+              <w:t>Chat: DENTRO del MVP (Opción B). Sin WebSocket; recarga manual.</w:t>
             </w:r>
           </w:p>
           <w:p>
             <w:r>
-              <w:t>Profesor jefe: campo role_in_course en course_teachers (HEAD_TEACHER, SUBJECT_TEACHER, ASSISTANT). Permisos diferenciados = mejora futura.</w:t>
+              <w:t>Profesor jefe: role_in_course en BD (HEAD_TEACHER, SUBJECT_TEACHER, ASSISTANT). Permisos parciales en anotaciones y calendario según rol docente.</w:t>
             </w:r>
           </w:p>
           <w:p>
             <w:r>
-              <w:t>Riesgo académico: alerta por bajo rendimiento o asistencia; no es módulo conductual.</w:t>
-            </w:r>
-          </w:p>
-          <w:p>
-            <w:r>
-              <w:t>ADMIN = administración global; COLEGIO = operación institucional.</w:t>
+              <w:t>Riesgo académico: promedio &lt; 4.0 o asistencia &lt; 85%. ADMIN/COLEGIO ven reporte institucional; PROFESOR ve alertas de sus cursos.</w:t>
             </w:r>
           </w:p>
           <w:p>
@@ -1355,32 +1340,22 @@
           </w:p>
           <w:p>
             <w:r>
-              <w:t>4. VALIDACIONES Y PRUEBAS FINALES</w:t>
+              <w:t>4. VALIDACIONES Y PRUEBAS</w:t>
             </w:r>
           </w:p>
           <w:p>
             <w:r>
-              <w:t>Caja blanca (Jest backend): 8 suites, 31 tests OK. Cobertura: Statements 62.87%, Branches 39.49%, Functions 50.51%, Lines 61.35%.</w:t>
+              <w:t>Caja blanca: 10 suites, 56 tests OK. Cobertura: Statements 64.87%, Branches 43.52%, Functions 52.21%, Lines 63.90%.</w:t>
             </w:r>
           </w:p>
           <w:p>
             <w:r>
-              <w:t>Caja negra: 13 casos manuales OK en local; 12+ casos OK en AWS/Vercel (login multirol, muro, notas, asistencia, usuarios, health). Chat y riesgo OK en local y Vercel; en S3 AWS parcial por frontend sin redeploy.</w:t>
+              <w:t>Caja negra/gris: 17 casos manuales OK documentados en matriz. Evidencias local, AWS y Vercel.</w:t>
             </w:r>
           </w:p>
           <w:p>
             <w:r>
-              <w:t>Caja gris: 4 flujos integrados OK (login→JWT→módulo académico; chat profesor; riesgo calculado; frontend Vercel→API Beanstalk).</w:t>
-            </w:r>
-          </w:p>
-          <w:p>
-            <w:r>
-              <w:t>Build backend npm run build: OK. Build frontend npm run build:vercel: OK.</w:t>
-            </w:r>
-          </w:p>
-          <w:p>
-            <w:r>
-              <w:t>Bug corregido: módulos chat, riesgo, usuarios y login quedaban en 'Cargando...' por Angular 21 sin zone.js; fix con ChangeDetectorRef.markForCheck().</w:t>
+              <w:t>Build backend y frontend: OK. Fix UI Angular 21 con ChangeDetectorRef en chat, riesgo, usuarios y login.</w:t>
             </w:r>
           </w:p>
           <w:p>
@@ -1388,12 +1363,12 @@
           </w:p>
           <w:p>
             <w:r>
-              <w:t>5. GESTIÓN DEL PROYECTO</w:t>
+              <w:t>5. DOCUMENTOS Y EVIDENCIAS</w:t>
             </w:r>
           </w:p>
           <w:p>
             <w:r>
-              <w:t>Integración: Pull Requests hacia develop desde ramas feature. Alcance alineado al MVP; mejoras futuras documentadas. Seguimiento con GitHub Issues y entregables semanales en docs/. Calidad: revisiones en equipo, pruebas automatizadas y manuales.</w:t>
+              <w:t>docs/semana-7/ con MD, DOCX, RESULTADOS_PRUEBAS_LOCAL.md y carpeta evidencias/ (local, aws, vercel).</w:t>
             </w:r>
           </w:p>
           <w:p>
@@ -1401,25 +1376,7 @@
           </w:p>
           <w:p>
             <w:r>
-              <w:t>6. DOCUMENTOS ACTUALIZADOS</w:t>
-            </w:r>
-          </w:p>
-          <w:p>
-            <w:r>
-              <w:t>docs/semana-7/TSY2201_EXP2_S7_Documento_Presentacion.md; PLAN_TRABAJO_SEMANA7.md; RESULTADOS_PRUEBAS_LOCAL.md; evidencias/ (local, aws, vercel).</w:t>
-            </w:r>
-          </w:p>
-          <w:p>
-            <w:r>
-              <w:t>backend/aulafy-api-nest/README.md; database/mysql/README.md; scripts de pruebas y deploy; configuración Vercel (vercel.json, middleware.ts).</w:t>
-            </w:r>
-          </w:p>
-          <w:p>
-            <w:r/>
-          </w:p>
-          <w:p>
-            <w:r>
-              <w:t>7. CUENTAS DEMO</w:t>
+              <w:t>6. CUENTAS DEMO</w:t>
             </w:r>
           </w:p>
           <w:p>
@@ -1432,30 +1389,12 @@
           </w:p>
           <w:p>
             <w:r>
-              <w:t>8. LIMITACIONES Y MEJORAS FUTURAS</w:t>
+              <w:t>7. LIMITACIONES</w:t>
             </w:r>
           </w:p>
           <w:p>
             <w:r>
-              <w:t>Chat sin tiempo real; permisos role_in_course no diferenciados en UI; umbrales de riesgo fijos; logout solo cliente; HTTP en S3; redeploy frontend S3 pendiente de credenciales AWS en GitHub Actions.</w:t>
-            </w:r>
-          </w:p>
-          <w:p>
-            <w:r/>
-          </w:p>
-          <w:p>
-            <w:r>
-              <w:t>9. EVIDENCIAS (docs/semana-7/evidencias/)</w:t>
-            </w:r>
-          </w:p>
-          <w:p>
-            <w:r>
-              <w:t>1_GitHub_rama_semana7_documentacion_cierre.png; 6_Cobertura_tests_backend.png; 7_Matriz_pruebas_negras.png; 8_Build_frontend_OK.png;</w:t>
-            </w:r>
-          </w:p>
-          <w:p>
-            <w:r>
-              <w:t>3_Chat_apoderado_funcionando.png; 4_Riesgo_academico_colegio.png; carpeta vercel/ (chat y riesgo en nube actualizada); carpeta aws/.</w:t>
+              <w:t>Chat sin tiempo real; moderación de chat no implementada; redeploy frontend S3 pendiente de credenciales AWS.</w:t>
             </w:r>
           </w:p>
         </w:tc>
@@ -1673,14 +1612,14 @@
     </w:p>
     <w:p>
       <w:r>
-        <w:t>GitHub — rama feature/semana-7-documentacion-cierre</w:t>
+        <w:t>Cobertura Jest — 56 tests</w:t>
       </w:r>
     </w:p>
     <w:p>
       <w:r>
         <w:drawing>
           <wp:inline>
-            <wp:extent cx="5669280" cy="3644537"/>
+            <wp:extent cx="5669280" cy="4903927"/>
             <wp:docPr id="1758041972" name="Picture 1758041972"/>
             <wp:cNvGraphicFramePr>
               <a:graphicFrameLocks noChangeAspect="1"/>
@@ -1689,11 +1628,53 @@
               <a:graphicData uri="http://schemas.openxmlformats.org/drawingml/2006/picture">
                 <pic:pic>
                   <pic:nvPicPr>
-                    <pic:cNvPr id="0" name="1_GitHub_rama_semana7_documentacion_cierre.png"/>
+                    <pic:cNvPr id="0" name="6_Cobertura_tests_backend.png"/>
                     <pic:cNvPicPr/>
                   </pic:nvPicPr>
                   <pic:blipFill>
                     <a:blip r:embed="rId18"/>
+                    <a:stretch>
+                      <a:fillRect/>
+                    </a:stretch>
+                  </pic:blipFill>
+                  <pic:spPr>
+                    <a:xfrm>
+                      <a:off x="0" y="0"/>
+                      <a:ext cx="5669280" cy="4903927"/>
+                    </a:xfrm>
+                    <a:prstGeom prst="rect"/>
+                  </pic:spPr>
+                </pic:pic>
+              </a:graphicData>
+            </a:graphic>
+          </wp:inline>
+        </w:drawing>
+      </w:r>
+    </w:p>
+    <w:p/>
+    <w:p>
+      <w:r>
+        <w:t>Matriz pruebas caja negra y gris</w:t>
+      </w:r>
+    </w:p>
+    <w:p>
+      <w:r>
+        <w:drawing>
+          <wp:inline>
+            <wp:extent cx="5669280" cy="3644537"/>
+            <wp:docPr id="1758041973" name="Picture 1758041973"/>
+            <wp:cNvGraphicFramePr>
+              <a:graphicFrameLocks noChangeAspect="1"/>
+            </wp:cNvGraphicFramePr>
+            <a:graphic>
+              <a:graphicData uri="http://schemas.openxmlformats.org/drawingml/2006/picture">
+                <pic:pic>
+                  <pic:nvPicPr>
+                    <pic:cNvPr id="0" name="7_Matriz_pruebas_negras.png"/>
+                    <pic:cNvPicPr/>
+                  </pic:nvPicPr>
+                  <pic:blipFill>
+                    <a:blip r:embed="rId19"/>
                     <a:stretch>
                       <a:fillRect/>
                     </a:stretch>
@@ -1715,90 +1696,6 @@
     <w:p/>
     <w:p>
       <w:r>
-        <w:t>Cobertura tests backend Jest</w:t>
-      </w:r>
-    </w:p>
-    <w:p>
-      <w:r>
-        <w:drawing>
-          <wp:inline>
-            <wp:extent cx="5669280" cy="3307080"/>
-            <wp:docPr id="1758041973" name="Picture 1758041973"/>
-            <wp:cNvGraphicFramePr>
-              <a:graphicFrameLocks noChangeAspect="1"/>
-            </wp:cNvGraphicFramePr>
-            <a:graphic>
-              <a:graphicData uri="http://schemas.openxmlformats.org/drawingml/2006/picture">
-                <pic:pic>
-                  <pic:nvPicPr>
-                    <pic:cNvPr id="0" name="6_Cobertura_tests_backend.png"/>
-                    <pic:cNvPicPr/>
-                  </pic:nvPicPr>
-                  <pic:blipFill>
-                    <a:blip r:embed="rId19"/>
-                    <a:stretch>
-                      <a:fillRect/>
-                    </a:stretch>
-                  </pic:blipFill>
-                  <pic:spPr>
-                    <a:xfrm>
-                      <a:off x="0" y="0"/>
-                      <a:ext cx="5669280" cy="3307080"/>
-                    </a:xfrm>
-                    <a:prstGeom prst="rect"/>
-                  </pic:spPr>
-                </pic:pic>
-              </a:graphicData>
-            </a:graphic>
-          </wp:inline>
-        </w:drawing>
-      </w:r>
-    </w:p>
-    <w:p/>
-    <w:p>
-      <w:r>
-        <w:t>Matriz pruebas caja negra y gris</w:t>
-      </w:r>
-    </w:p>
-    <w:p>
-      <w:r>
-        <w:drawing>
-          <wp:inline>
-            <wp:extent cx="5669280" cy="3644537"/>
-            <wp:docPr id="1758041974" name="Picture 1758041974"/>
-            <wp:cNvGraphicFramePr>
-              <a:graphicFrameLocks noChangeAspect="1"/>
-            </wp:cNvGraphicFramePr>
-            <a:graphic>
-              <a:graphicData uri="http://schemas.openxmlformats.org/drawingml/2006/picture">
-                <pic:pic>
-                  <pic:nvPicPr>
-                    <pic:cNvPr id="0" name="7_Matriz_pruebas_negras.png"/>
-                    <pic:cNvPicPr/>
-                  </pic:nvPicPr>
-                  <pic:blipFill>
-                    <a:blip r:embed="rId20"/>
-                    <a:stretch>
-                      <a:fillRect/>
-                    </a:stretch>
-                  </pic:blipFill>
-                  <pic:spPr>
-                    <a:xfrm>
-                      <a:off x="0" y="0"/>
-                      <a:ext cx="5669280" cy="3644537"/>
-                    </a:xfrm>
-                    <a:prstGeom prst="rect"/>
-                  </pic:spPr>
-                </pic:pic>
-              </a:graphicData>
-            </a:graphic>
-          </wp:inline>
-        </w:drawing>
-      </w:r>
-    </w:p>
-    <w:p/>
-    <w:p>
-      <w:r>
         <w:t>Build frontend exitoso</w:t>
       </w:r>
     </w:p>
@@ -1807,7 +1704,7 @@
         <w:drawing>
           <wp:inline>
             <wp:extent cx="5669280" cy="3986212"/>
-            <wp:docPr id="1758041975" name="Picture 1758041975"/>
+            <wp:docPr id="1758041974" name="Picture 1758041974"/>
             <wp:cNvGraphicFramePr>
               <a:graphicFrameLocks noChangeAspect="1"/>
             </wp:cNvGraphicFramePr>
@@ -1819,7 +1716,7 @@
                     <pic:cNvPicPr/>
                   </pic:nvPicPr>
                   <pic:blipFill>
-                    <a:blip r:embed="rId21"/>
+                    <a:blip r:embed="rId20"/>
                     <a:stretch>
                       <a:fillRect/>
                     </a:stretch>
@@ -1841,14 +1738,56 @@
     <w:p/>
     <w:p>
       <w:r>
-        <w:t>Login frontend Vercel</w:t>
+        <w:t>Riesgo académico — rol PROFESOR</w:t>
       </w:r>
     </w:p>
     <w:p>
       <w:r>
         <w:drawing>
           <wp:inline>
-            <wp:extent cx="5669280" cy="3986212"/>
+            <wp:extent cx="5669280" cy="4048220"/>
+            <wp:docPr id="1758041975" name="Picture 1758041975"/>
+            <wp:cNvGraphicFramePr>
+              <a:graphicFrameLocks noChangeAspect="1"/>
+            </wp:cNvGraphicFramePr>
+            <a:graphic>
+              <a:graphicData uri="http://schemas.openxmlformats.org/drawingml/2006/picture">
+                <pic:pic>
+                  <pic:nvPicPr>
+                    <pic:cNvPr id="0" name="9_Vercel_profesor_riesgo_academico.png"/>
+                    <pic:cNvPicPr/>
+                  </pic:nvPicPr>
+                  <pic:blipFill>
+                    <a:blip r:embed="rId21"/>
+                    <a:stretch>
+                      <a:fillRect/>
+                    </a:stretch>
+                  </pic:blipFill>
+                  <pic:spPr>
+                    <a:xfrm>
+                      <a:off x="0" y="0"/>
+                      <a:ext cx="5669280" cy="4048220"/>
+                    </a:xfrm>
+                    <a:prstGeom prst="rect"/>
+                  </pic:spPr>
+                </pic:pic>
+              </a:graphicData>
+            </a:graphic>
+          </wp:inline>
+        </w:drawing>
+      </w:r>
+    </w:p>
+    <w:p/>
+    <w:p>
+      <w:r>
+        <w:t>Dashboard apoderado — Mensajes del curso</w:t>
+      </w:r>
+    </w:p>
+    <w:p>
+      <w:r>
+        <w:drawing>
+          <wp:inline>
+            <wp:extent cx="5669280" cy="4544282"/>
             <wp:docPr id="1758041976" name="Picture 1758041976"/>
             <wp:cNvGraphicFramePr>
               <a:graphicFrameLocks noChangeAspect="1"/>
@@ -1857,7 +1796,7 @@
               <a:graphicData uri="http://schemas.openxmlformats.org/drawingml/2006/picture">
                 <pic:pic>
                   <pic:nvPicPr>
-                    <pic:cNvPr id="0" name="2_Frontend_Vercel_login.png"/>
+                    <pic:cNvPr id="0" name="10_Vercel_apoderado_dashboard_mensajes.png"/>
                     <pic:cNvPicPr/>
                   </pic:nvPicPr>
                   <pic:blipFill>
@@ -1869,7 +1808,7 @@
                   <pic:spPr>
                     <a:xfrm>
                       <a:off x="0" y="0"/>
-                      <a:ext cx="5669280" cy="3986212"/>
+                      <a:ext cx="5669280" cy="4544282"/>
                     </a:xfrm>
                     <a:prstGeom prst="rect"/>
                   </pic:spPr>
@@ -1883,7 +1822,7 @@
     <w:p/>
     <w:p>
       <w:r>
-        <w:t>Chat funcionando — Vercel + Beanstalk</w:t>
+        <w:t>Chat — Vercel + Beanstalk</w:t>
       </w:r>
     </w:p>
     <w:p>
@@ -1925,7 +1864,7 @@
     <w:p/>
     <w:p>
       <w:r>
-        <w:t>Riesgo académico — Vercel + Beanstalk</w:t>
+        <w:t>Health backend vía proxy Vercel</w:t>
       </w:r>
     </w:p>
     <w:p>
@@ -1941,53 +1880,11 @@
               <a:graphicData uri="http://schemas.openxmlformats.org/drawingml/2006/picture">
                 <pic:pic>
                   <pic:nvPicPr>
-                    <pic:cNvPr id="0" name="5_Vercel_admin_riesgo_academico.png"/>
+                    <pic:cNvPr id="0" name="1_Vercel_proxy_health_Beanstalk.png"/>
                     <pic:cNvPicPr/>
                   </pic:nvPicPr>
                   <pic:blipFill>
                     <a:blip r:embed="rId24"/>
-                    <a:stretch>
-                      <a:fillRect/>
-                    </a:stretch>
-                  </pic:blipFill>
-                  <pic:spPr>
-                    <a:xfrm>
-                      <a:off x="0" y="0"/>
-                      <a:ext cx="5669280" cy="3986212"/>
-                    </a:xfrm>
-                    <a:prstGeom prst="rect"/>
-                  </pic:spPr>
-                </pic:pic>
-              </a:graphicData>
-            </a:graphic>
-          </wp:inline>
-        </w:drawing>
-      </w:r>
-    </w:p>
-    <w:p/>
-    <w:p>
-      <w:r>
-        <w:t>Health backend vía proxy Vercel</w:t>
-      </w:r>
-    </w:p>
-    <w:p>
-      <w:r>
-        <w:drawing>
-          <wp:inline>
-            <wp:extent cx="5669280" cy="3986212"/>
-            <wp:docPr id="1758041979" name="Picture 1758041979"/>
-            <wp:cNvGraphicFramePr>
-              <a:graphicFrameLocks noChangeAspect="1"/>
-            </wp:cNvGraphicFramePr>
-            <a:graphic>
-              <a:graphicData uri="http://schemas.openxmlformats.org/drawingml/2006/picture">
-                <pic:pic>
-                  <pic:nvPicPr>
-                    <pic:cNvPr id="0" name="1_Vercel_proxy_health_Beanstalk.png"/>
-                    <pic:cNvPicPr/>
-                  </pic:nvPicPr>
-                  <pic:blipFill>
-                    <a:blip r:embed="rId25"/>
                     <a:stretch>
                       <a:fillRect/>
                     </a:stretch>

</xml_diff>

<commit_message>
docs(semana-7): evidencias AWS, scripts deploy y DOCX actualizado
Incluye capturas AWS regeneradas, scripts de deploy automatizado,
documentación con URLs oficiales del equipo y respaldo, y DOCX Semana 7.
</commit_message>
<xml_diff>
--- a/docs/semana-7/TSY2201_EXP2_S7_Formato_respuesta_Aulafy_Semana7.docx
+++ b/docs/semana-7/TSY2201_EXP2_S7_Formato_respuesta_Aulafy_Semana7.docx
@@ -1154,7 +1154,12 @@
           </w:tcPr>
           <w:p>
             <w:r>
-              <w:t>Frontend (Vercel — versión actual): https://aulafy-web.vercel.app</w:t>
+              <w:t>Frontend (Vercel — HTTPS): https://aulafy-web.vercel.app</w:t>
+            </w:r>
+          </w:p>
+          <w:p>
+            <w:r>
+              <w:t>Frontend AWS S3: http://aulafy-frontend-803615173905.s3-website.us-east-2.amazonaws.com</w:t>
             </w:r>
           </w:p>
           <w:p>
@@ -1170,6 +1175,11 @@
           <w:p>
             <w:r>
               <w:t>Vercel consume el backend AWS mediante proxy /api. Base de datos: Amazon RDS MySQL 8.x.</w:t>
+            </w:r>
+          </w:p>
+          <w:p>
+            <w:r>
+              <w:t>Respaldo (si no alcanza redeploy en AWS del equipo): frontend http://aulafy-frontend-605134438568.s3-website.us-east-2.amazonaws.com — backend http://aulafy-api-staging-sbriceno.eba-57zmbb7c.us-east-2.elasticbeanstalk.com/api</w:t>
             </w:r>
           </w:p>
         </w:tc>
@@ -1394,7 +1404,7 @@
           </w:p>
           <w:p>
             <w:r>
-              <w:t>Chat sin tiempo real; moderación de chat no implementada; redeploy frontend S3 pendiente de credenciales AWS.</w:t>
+              <w:t>Chat sin tiempo real; moderación de chat no implementada; S3 sin HTTPS (CloudFront proyectado).</w:t>
             </w:r>
           </w:p>
         </w:tc>
@@ -1738,14 +1748,14 @@
     <w:p/>
     <w:p>
       <w:r>
-        <w:t>Riesgo académico — rol PROFESOR</w:t>
+        <w:t>Login — AWS S3 Semana 7</w:t>
       </w:r>
     </w:p>
     <w:p>
       <w:r>
         <w:drawing>
           <wp:inline>
-            <wp:extent cx="5669280" cy="4048220"/>
+            <wp:extent cx="5669280" cy="3986212"/>
             <wp:docPr id="1758041975" name="Picture 1758041975"/>
             <wp:cNvGraphicFramePr>
               <a:graphicFrameLocks noChangeAspect="1"/>
@@ -1754,7 +1764,7 @@
               <a:graphicData uri="http://schemas.openxmlformats.org/drawingml/2006/picture">
                 <pic:pic>
                   <pic:nvPicPr>
-                    <pic:cNvPr id="0" name="9_Vercel_profesor_riesgo_academico.png"/>
+                    <pic:cNvPr id="0" name="2_Frontend_AWS_login.png"/>
                     <pic:cNvPicPr/>
                   </pic:nvPicPr>
                   <pic:blipFill>
@@ -1766,7 +1776,7 @@
                   <pic:spPr>
                     <a:xfrm>
                       <a:off x="0" y="0"/>
-                      <a:ext cx="5669280" cy="4048220"/>
+                      <a:ext cx="5669280" cy="3986212"/>
                     </a:xfrm>
                     <a:prstGeom prst="rect"/>
                   </pic:spPr>
@@ -1780,14 +1790,14 @@
     <w:p/>
     <w:p>
       <w:r>
-        <w:t>Dashboard apoderado — Mensajes del curso</w:t>
+        <w:t>Chat apoderado — AWS</w:t>
       </w:r>
     </w:p>
     <w:p>
       <w:r>
         <w:drawing>
           <wp:inline>
-            <wp:extent cx="5669280" cy="4544282"/>
+            <wp:extent cx="5669280" cy="3986212"/>
             <wp:docPr id="1758041976" name="Picture 1758041976"/>
             <wp:cNvGraphicFramePr>
               <a:graphicFrameLocks noChangeAspect="1"/>
@@ -1796,7 +1806,7 @@
               <a:graphicData uri="http://schemas.openxmlformats.org/drawingml/2006/picture">
                 <pic:pic>
                   <pic:nvPicPr>
-                    <pic:cNvPr id="0" name="10_Vercel_apoderado_dashboard_mensajes.png"/>
+                    <pic:cNvPr id="0" name="3_Chat_apoderado_funcionando_AWS.png"/>
                     <pic:cNvPicPr/>
                   </pic:nvPicPr>
                   <pic:blipFill>
@@ -1808,7 +1818,7 @@
                   <pic:spPr>
                     <a:xfrm>
                       <a:off x="0" y="0"/>
-                      <a:ext cx="5669280" cy="4544282"/>
+                      <a:ext cx="5669280" cy="3986212"/>
                     </a:xfrm>
                     <a:prstGeom prst="rect"/>
                   </pic:spPr>
@@ -1822,7 +1832,7 @@
     <w:p/>
     <w:p>
       <w:r>
-        <w:t>Chat — Vercel + Beanstalk</w:t>
+        <w:t>Riesgo académico — AWS COLEGIO</w:t>
       </w:r>
     </w:p>
     <w:p>
@@ -1838,7 +1848,7 @@
               <a:graphicData uri="http://schemas.openxmlformats.org/drawingml/2006/picture">
                 <pic:pic>
                   <pic:nvPicPr>
-                    <pic:cNvPr id="0" name="4_Vercel_admin_chat_funcionando.png"/>
+                    <pic:cNvPr id="0" name="4_Riesgo_academico_colegio_AWS.png"/>
                     <pic:cNvPicPr/>
                   </pic:nvPicPr>
                   <pic:blipFill>
@@ -1864,7 +1874,7 @@
     <w:p/>
     <w:p>
       <w:r>
-        <w:t>Health backend vía proxy Vercel</w:t>
+        <w:t>Health backend — AWS EB</w:t>
       </w:r>
     </w:p>
     <w:p>
@@ -1880,7 +1890,175 @@
               <a:graphicData uri="http://schemas.openxmlformats.org/drawingml/2006/picture">
                 <pic:pic>
                   <pic:nvPicPr>
-                    <pic:cNvPr id="0" name="1_Vercel_proxy_health_Beanstalk.png"/>
+                    <pic:cNvPr id="0" name="5_Backend_AWS_health.png"/>
+                    <pic:cNvPicPr/>
+                  </pic:nvPicPr>
+                  <pic:blipFill>
+                    <a:blip r:embed="rId24"/>
+                    <a:stretch>
+                      <a:fillRect/>
+                    </a:stretch>
+                  </pic:blipFill>
+                  <pic:spPr>
+                    <a:xfrm>
+                      <a:off x="0" y="0"/>
+                      <a:ext cx="5669280" cy="3986212"/>
+                    </a:xfrm>
+                    <a:prstGeom prst="rect"/>
+                  </pic:spPr>
+                </pic:pic>
+              </a:graphicData>
+            </a:graphic>
+          </wp:inline>
+        </w:drawing>
+      </w:r>
+    </w:p>
+    <w:p/>
+    <w:p>
+      <w:r>
+        <w:t>Riesgo académico — rol PROFESOR</w:t>
+      </w:r>
+    </w:p>
+    <w:p>
+      <w:r>
+        <w:drawing>
+          <wp:inline>
+            <wp:extent cx="5669280" cy="4048220"/>
+            <wp:docPr id="1758041979" name="Picture 1758041979"/>
+            <wp:cNvGraphicFramePr>
+              <a:graphicFrameLocks noChangeAspect="1"/>
+            </wp:cNvGraphicFramePr>
+            <a:graphic>
+              <a:graphicData uri="http://schemas.openxmlformats.org/drawingml/2006/picture">
+                <pic:pic>
+                  <pic:nvPicPr>
+                    <pic:cNvPr id="0" name="9_Vercel_profesor_riesgo_academico.png"/>
+                    <pic:cNvPicPr/>
+                  </pic:nvPicPr>
+                  <pic:blipFill>
+                    <a:blip r:embed="rId25"/>
+                    <a:stretch>
+                      <a:fillRect/>
+                    </a:stretch>
+                  </pic:blipFill>
+                  <pic:spPr>
+                    <a:xfrm>
+                      <a:off x="0" y="0"/>
+                      <a:ext cx="5669280" cy="4048220"/>
+                    </a:xfrm>
+                    <a:prstGeom prst="rect"/>
+                  </pic:spPr>
+                </pic:pic>
+              </a:graphicData>
+            </a:graphic>
+          </wp:inline>
+        </w:drawing>
+      </w:r>
+    </w:p>
+    <w:p/>
+    <w:p>
+      <w:r>
+        <w:t>Dashboard apoderado — Mensajes del curso</w:t>
+      </w:r>
+    </w:p>
+    <w:p>
+      <w:r>
+        <w:drawing>
+          <wp:inline>
+            <wp:extent cx="5669280" cy="4544282"/>
+            <wp:docPr id="1758041980" name="Picture 1758041980"/>
+            <wp:cNvGraphicFramePr>
+              <a:graphicFrameLocks noChangeAspect="1"/>
+            </wp:cNvGraphicFramePr>
+            <a:graphic>
+              <a:graphicData uri="http://schemas.openxmlformats.org/drawingml/2006/picture">
+                <pic:pic>
+                  <pic:nvPicPr>
+                    <pic:cNvPr id="0" name="10_Vercel_apoderado_dashboard_mensajes.png"/>
+                    <pic:cNvPicPr/>
+                  </pic:nvPicPr>
+                  <pic:blipFill>
+                    <a:blip r:embed="rId26"/>
+                    <a:stretch>
+                      <a:fillRect/>
+                    </a:stretch>
+                  </pic:blipFill>
+                  <pic:spPr>
+                    <a:xfrm>
+                      <a:off x="0" y="0"/>
+                      <a:ext cx="5669280" cy="4544282"/>
+                    </a:xfrm>
+                    <a:prstGeom prst="rect"/>
+                  </pic:spPr>
+                </pic:pic>
+              </a:graphicData>
+            </a:graphic>
+          </wp:inline>
+        </w:drawing>
+      </w:r>
+    </w:p>
+    <w:p/>
+    <w:p>
+      <w:r>
+        <w:t>Chat — Vercel + Beanstalk</w:t>
+      </w:r>
+    </w:p>
+    <w:p>
+      <w:r>
+        <w:drawing>
+          <wp:inline>
+            <wp:extent cx="5669280" cy="3986212"/>
+            <wp:docPr id="1758041981" name="Picture 1758041981"/>
+            <wp:cNvGraphicFramePr>
+              <a:graphicFrameLocks noChangeAspect="1"/>
+            </wp:cNvGraphicFramePr>
+            <a:graphic>
+              <a:graphicData uri="http://schemas.openxmlformats.org/drawingml/2006/picture">
+                <pic:pic>
+                  <pic:nvPicPr>
+                    <pic:cNvPr id="0" name="4_Vercel_admin_chat_funcionando.png"/>
+                    <pic:cNvPicPr/>
+                  </pic:nvPicPr>
+                  <pic:blipFill>
+                    <a:blip r:embed="rId27"/>
+                    <a:stretch>
+                      <a:fillRect/>
+                    </a:stretch>
+                  </pic:blipFill>
+                  <pic:spPr>
+                    <a:xfrm>
+                      <a:off x="0" y="0"/>
+                      <a:ext cx="5669280" cy="3986212"/>
+                    </a:xfrm>
+                    <a:prstGeom prst="rect"/>
+                  </pic:spPr>
+                </pic:pic>
+              </a:graphicData>
+            </a:graphic>
+          </wp:inline>
+        </w:drawing>
+      </w:r>
+    </w:p>
+    <w:p/>
+    <w:p>
+      <w:r>
+        <w:t>Health backend vía proxy Vercel</w:t>
+      </w:r>
+    </w:p>
+    <w:p>
+      <w:r>
+        <w:drawing>
+          <wp:inline>
+            <wp:extent cx="5669280" cy="3986212"/>
+            <wp:docPr id="1758041982" name="Picture 1758041982"/>
+            <wp:cNvGraphicFramePr>
+              <a:graphicFrameLocks noChangeAspect="1"/>
+            </wp:cNvGraphicFramePr>
+            <a:graphic>
+              <a:graphicData uri="http://schemas.openxmlformats.org/drawingml/2006/picture">
+                <pic:pic>
+                  <pic:nvPicPr>
+                    <pic:cNvPr id="0" name="5_Backend_AWS_health.png"/>
                     <pic:cNvPicPr/>
                   </pic:nvPicPr>
                   <pic:blipFill>

</xml_diff>